<commit_message>
More encoding and scaling
learning encoding and scaling
</commit_message>
<xml_diff>
--- a/Encoding/Encoding and scaling.docx
+++ b/Encoding/Encoding and scaling.docx
@@ -317,6 +317,609 @@
       <w:r>
         <w:rPr/>
         <w:t>Lots of 0s too means the data becomes sparse, negative on the ML.</w:t>
+      </w:r>
+    </w:p>
+    <w:p>
+      <w:pPr>
+        <w:pStyle w:val="Normal"/>
+        <w:bidi w:val="0"/>
+        <w:rPr/>
+      </w:pPr>
+      <w:r>
+        <w:rPr/>
+      </w:r>
+    </w:p>
+    <w:p>
+      <w:pPr>
+        <w:pStyle w:val="Normal"/>
+        <w:bidi w:val="0"/>
+        <w:rPr/>
+      </w:pPr>
+      <w:r>
+        <w:rPr/>
+      </w:r>
+    </w:p>
+    <w:p>
+      <w:pPr>
+        <w:pStyle w:val="Normal"/>
+        <w:bidi w:val="0"/>
+        <w:rPr/>
+      </w:pPr>
+      <w:r>
+        <w:rPr/>
+        <w:t>the target variable we pick based on what we want to make a prediction on</w:t>
+      </w:r>
+    </w:p>
+    <w:p>
+      <w:pPr>
+        <w:pStyle w:val="Normal"/>
+        <w:bidi w:val="0"/>
+        <w:rPr/>
+      </w:pPr>
+      <w:r>
+        <w:rPr/>
+      </w:r>
+    </w:p>
+    <w:p>
+      <w:pPr>
+        <w:pStyle w:val="Normal"/>
+        <w:bidi w:val="0"/>
+        <w:rPr/>
+      </w:pPr>
+      <w:r>
+        <w:rPr/>
+      </w:r>
+    </w:p>
+    <w:p>
+      <w:pPr>
+        <w:pStyle w:val="Normal"/>
+        <w:bidi w:val="0"/>
+        <w:rPr/>
+      </w:pPr>
+      <w:r>
+        <w:rPr/>
+      </w:r>
+    </w:p>
+    <w:p>
+      <w:pPr>
+        <w:pStyle w:val="Normal"/>
+        <w:bidi w:val="0"/>
+        <w:rPr/>
+      </w:pPr>
+      <w:r>
+        <w:rPr/>
+      </w:r>
+    </w:p>
+    <w:p>
+      <w:pPr>
+        <w:pStyle w:val="Normal"/>
+        <w:bidi w:val="0"/>
+        <w:rPr/>
+      </w:pPr>
+      <w:r>
+        <w:rPr/>
+      </w:r>
+    </w:p>
+    <w:p>
+      <w:pPr>
+        <w:pStyle w:val="Normal"/>
+        <w:bidi w:val="0"/>
+        <w:rPr/>
+      </w:pPr>
+      <w:r>
+        <w:rPr/>
+      </w:r>
+    </w:p>
+    <w:p>
+      <w:pPr>
+        <w:pStyle w:val="Normal"/>
+        <w:bidi w:val="0"/>
+        <w:rPr/>
+      </w:pPr>
+      <w:r>
+        <w:rPr/>
+      </w:r>
+    </w:p>
+    <w:p>
+      <w:pPr>
+        <w:pStyle w:val="Normal"/>
+        <w:bidi w:val="0"/>
+        <w:rPr/>
+      </w:pPr>
+      <w:r>
+        <w:rPr/>
+      </w:r>
+    </w:p>
+    <w:p>
+      <w:pPr>
+        <w:pStyle w:val="Normal"/>
+        <w:bidi w:val="0"/>
+        <w:rPr/>
+      </w:pPr>
+      <w:r>
+        <w:rPr/>
+      </w:r>
+    </w:p>
+    <w:p>
+      <w:pPr>
+        <w:pStyle w:val="Normal"/>
+        <w:bidi w:val="0"/>
+        <w:rPr/>
+      </w:pPr>
+      <w:r>
+        <w:rPr/>
+      </w:r>
+    </w:p>
+    <w:p>
+      <w:pPr>
+        <w:pStyle w:val="Normal"/>
+        <w:bidi w:val="0"/>
+        <w:rPr/>
+      </w:pPr>
+      <w:r>
+        <w:rPr/>
+        <w:t>Scaling data:</w:t>
+      </w:r>
+    </w:p>
+    <w:p>
+      <w:pPr>
+        <w:pStyle w:val="Normal"/>
+        <w:bidi w:val="0"/>
+        <w:rPr/>
+      </w:pPr>
+      <w:r>
+        <w:rPr/>
+        <w:t>Is the number 1 technique people get wrong</w:t>
+      </w:r>
+    </w:p>
+    <w:p>
+      <w:pPr>
+        <w:pStyle w:val="Normal"/>
+        <w:bidi w:val="0"/>
+        <w:rPr/>
+      </w:pPr>
+      <w:r>
+        <w:rPr/>
+        <w:t>Scale a variable whenever that variable is spread out over numerous</w:t>
+      </w:r>
+    </w:p>
+    <w:p>
+      <w:pPr>
+        <w:pStyle w:val="Normal"/>
+        <w:bidi w:val="0"/>
+        <w:rPr/>
+      </w:pPr>
+      <w:r>
+        <w:rPr/>
+        <w:t>Imagine we have a set of numbers:</w:t>
+      </w:r>
+    </w:p>
+    <w:p>
+      <w:pPr>
+        <w:pStyle w:val="Normal"/>
+        <w:bidi w:val="0"/>
+        <w:rPr/>
+      </w:pPr>
+      <w:r>
+        <w:rPr/>
+        <w:tab/>
+      </w:r>
+      <w:r>
+        <w:drawing>
+          <wp:anchor distT="0" distB="0" distL="0" distR="0" simplePos="0" relativeHeight="3" behindDoc="0" locked="0" layoutInCell="0" allowOverlap="1">
+            <wp:simplePos x="0" y="0"/>
+            <wp:positionH relativeFrom="column">
+              <wp:align>center</wp:align>
+            </wp:positionH>
+            <wp:positionV relativeFrom="paragraph">
+              <wp:posOffset>635</wp:posOffset>
+            </wp:positionV>
+            <wp:extent cx="6120130" cy="2362200"/>
+            <wp:effectExtent l="0" t="0" r="0" b="0"/>
+            <wp:wrapSquare wrapText="largest"/>
+            <wp:docPr id="2" name="Image2"/>
+            <wp:cNvGraphicFramePr>
+              <a:graphicFrameLocks xmlns:a="http://schemas.openxmlformats.org/drawingml/2006/main" noChangeAspect="1"/>
+            </wp:cNvGraphicFramePr>
+            <a:graphic xmlns:a="http://schemas.openxmlformats.org/drawingml/2006/main">
+              <a:graphicData uri="http://schemas.openxmlformats.org/drawingml/2006/picture">
+                <pic:pic xmlns:pic="http://schemas.openxmlformats.org/drawingml/2006/picture">
+                  <pic:nvPicPr>
+                    <pic:cNvPr id="2" name="Image2"/>
+                    <pic:cNvPicPr>
+                      <a:picLocks noChangeAspect="1" noChangeArrowheads="1"/>
+                    </pic:cNvPicPr>
+                  </pic:nvPicPr>
+                  <pic:blipFill>
+                    <a:blip r:embed="rId3"/>
+                    <a:stretch>
+                      <a:fillRect/>
+                    </a:stretch>
+                  </pic:blipFill>
+                  <pic:spPr bwMode="auto">
+                    <a:xfrm>
+                      <a:off x="0" y="0"/>
+                      <a:ext cx="6120130" cy="2362200"/>
+                    </a:xfrm>
+                    <a:prstGeom prst="rect">
+                      <a:avLst/>
+                    </a:prstGeom>
+                    <a:noFill/>
+                  </pic:spPr>
+                </pic:pic>
+              </a:graphicData>
+            </a:graphic>
+          </wp:anchor>
+        </w:drawing>
+      </w:r>
+    </w:p>
+    <w:p>
+      <w:pPr>
+        <w:pStyle w:val="Normal"/>
+        <w:bidi w:val="0"/>
+        <w:rPr/>
+      </w:pPr>
+      <w:r>
+        <w:rPr/>
+      </w:r>
+    </w:p>
+    <w:p>
+      <w:pPr>
+        <w:pStyle w:val="Normal"/>
+        <w:bidi w:val="0"/>
+        <w:rPr/>
+      </w:pPr>
+      <w:r>
+        <w:rPr/>
+        <w:t>Where does 0.9 go . It goes into the first one, 57 goes into tenths exectra</w:t>
+      </w:r>
+    </w:p>
+    <w:p>
+      <w:pPr>
+        <w:pStyle w:val="Normal"/>
+        <w:bidi w:val="0"/>
+        <w:rPr/>
+      </w:pPr>
+      <w:r>
+        <w:rPr/>
+        <w:drawing>
+          <wp:anchor distT="0" distB="0" distL="0" distR="0" simplePos="0" relativeHeight="4" behindDoc="0" locked="0" layoutInCell="0" allowOverlap="1">
+            <wp:simplePos x="0" y="0"/>
+            <wp:positionH relativeFrom="column">
+              <wp:align>center</wp:align>
+            </wp:positionH>
+            <wp:positionV relativeFrom="paragraph">
+              <wp:posOffset>635</wp:posOffset>
+            </wp:positionV>
+            <wp:extent cx="6120130" cy="2399030"/>
+            <wp:effectExtent l="0" t="0" r="0" b="0"/>
+            <wp:wrapSquare wrapText="largest"/>
+            <wp:docPr id="3" name="Image3"/>
+            <wp:cNvGraphicFramePr>
+              <a:graphicFrameLocks xmlns:a="http://schemas.openxmlformats.org/drawingml/2006/main" noChangeAspect="1"/>
+            </wp:cNvGraphicFramePr>
+            <a:graphic xmlns:a="http://schemas.openxmlformats.org/drawingml/2006/main">
+              <a:graphicData uri="http://schemas.openxmlformats.org/drawingml/2006/picture">
+                <pic:pic xmlns:pic="http://schemas.openxmlformats.org/drawingml/2006/picture">
+                  <pic:nvPicPr>
+                    <pic:cNvPr id="3" name="Image3"/>
+                    <pic:cNvPicPr>
+                      <a:picLocks noChangeAspect="1" noChangeArrowheads="1"/>
+                    </pic:cNvPicPr>
+                  </pic:nvPicPr>
+                  <pic:blipFill>
+                    <a:blip r:embed="rId4"/>
+                    <a:stretch>
+                      <a:fillRect/>
+                    </a:stretch>
+                  </pic:blipFill>
+                  <pic:spPr bwMode="auto">
+                    <a:xfrm>
+                      <a:off x="0" y="0"/>
+                      <a:ext cx="6120130" cy="2399030"/>
+                    </a:xfrm>
+                    <a:prstGeom prst="rect">
+                      <a:avLst/>
+                    </a:prstGeom>
+                    <a:noFill/>
+                  </pic:spPr>
+                </pic:pic>
+              </a:graphicData>
+            </a:graphic>
+          </wp:anchor>
+        </w:drawing>
+      </w:r>
+    </w:p>
+    <w:p>
+      <w:pPr>
+        <w:pStyle w:val="Normal"/>
+        <w:bidi w:val="0"/>
+        <w:rPr/>
+      </w:pPr>
+      <w:r>
+        <w:rPr/>
+      </w:r>
+    </w:p>
+    <w:p>
+      <w:pPr>
+        <w:pStyle w:val="Normal"/>
+        <w:bidi w:val="0"/>
+        <w:rPr/>
+      </w:pPr>
+      <w:r>
+        <w:rPr/>
+      </w:r>
+    </w:p>
+    <w:p>
+      <w:pPr>
+        <w:pStyle w:val="Normal"/>
+        <w:bidi w:val="0"/>
+        <w:rPr/>
+      </w:pPr>
+      <w:r>
+        <w:rPr/>
+        <w:t>The numbers are spread over the number line, going into tenths, units, tens, hundreds, thousands.</w:t>
+      </w:r>
+    </w:p>
+    <w:p>
+      <w:pPr>
+        <w:pStyle w:val="Normal"/>
+        <w:bidi w:val="0"/>
+        <w:rPr/>
+      </w:pPr>
+      <w:r>
+        <w:rPr/>
+        <w:t>if we multiply big numbers they go up.</w:t>
+      </w:r>
+    </w:p>
+    <w:p>
+      <w:pPr>
+        <w:pStyle w:val="Normal"/>
+        <w:bidi w:val="0"/>
+        <w:rPr/>
+      </w:pPr>
+      <w:r>
+        <w:rPr/>
+        <w:t>If we multiply small number like 0.9 and 0.4 they go down.</w:t>
+      </w:r>
+    </w:p>
+    <w:p>
+      <w:pPr>
+        <w:pStyle w:val="Normal"/>
+        <w:bidi w:val="0"/>
+        <w:rPr/>
+      </w:pPr>
+      <w:r>
+        <w:rPr/>
+        <w:t>Because of the big spread we scale the data/features, typically we don’t scale the target data though</w:t>
+      </w:r>
+    </w:p>
+    <w:p>
+      <w:pPr>
+        <w:pStyle w:val="Normal"/>
+        <w:bidi w:val="0"/>
+        <w:rPr/>
+      </w:pPr>
+      <w:r>
+        <w:rPr/>
+      </w:r>
+    </w:p>
+    <w:p>
+      <w:pPr>
+        <w:pStyle w:val="Normal"/>
+        <w:bidi w:val="0"/>
+        <w:rPr/>
+      </w:pPr>
+      <w:r>
+        <w:rPr/>
+        <w:t>4 different types of scaling:</w:t>
+      </w:r>
+    </w:p>
+    <w:p>
+      <w:pPr>
+        <w:pStyle w:val="Normal"/>
+        <w:bidi w:val="0"/>
+        <w:rPr/>
+      </w:pPr>
+      <w:r>
+        <w:rPr/>
+        <w:t>1. Standard scaler if data is nicely distributed, bell curve.</w:t>
+      </w:r>
+    </w:p>
+    <w:p>
+      <w:pPr>
+        <w:pStyle w:val="Normal"/>
+        <w:bidi w:val="0"/>
+        <w:rPr/>
+      </w:pPr>
+      <w:r>
+        <w:rPr/>
+        <w:t>2.Min/max if data is scaled to the left or right/ skewed.</w:t>
+      </w:r>
+    </w:p>
+    <w:p>
+      <w:pPr>
+        <w:pStyle w:val="Normal"/>
+        <w:bidi w:val="0"/>
+        <w:rPr/>
+      </w:pPr>
+      <w:r>
+        <w:rPr/>
+        <w:t>3.Robust scaler if the data has outliers no matter if nicely distr</w:t>
+      </w:r>
+      <w:r>
+        <w:rPr/>
+        <w:t>i</w:t>
+      </w:r>
+      <w:r>
+        <w:rPr/>
+        <w:t>b</w:t>
+      </w:r>
+      <w:r>
+        <w:rPr/>
+        <w:t>u</w:t>
+      </w:r>
+      <w:r>
+        <w:rPr/>
+        <w:t>ted or left and right/</w:t>
+      </w:r>
+      <w:r>
+        <w:rPr/>
+        <w:t>sparse.</w:t>
+      </w:r>
+    </w:p>
+    <w:p>
+      <w:pPr>
+        <w:pStyle w:val="Normal"/>
+        <w:bidi w:val="0"/>
+        <w:rPr/>
+      </w:pPr>
+      <w:r>
+        <w:rPr/>
+        <w:t>4.Normalisation if the data is sparse, lots of 0s. L2 normalisation.</w:t>
+      </w:r>
+    </w:p>
+    <w:p>
+      <w:pPr>
+        <w:pStyle w:val="Normal"/>
+        <w:bidi w:val="0"/>
+        <w:rPr/>
+      </w:pPr>
+      <w:r>
+        <w:rPr/>
+      </w:r>
+    </w:p>
+    <w:p>
+      <w:pPr>
+        <w:pStyle w:val="Normal"/>
+        <w:bidi w:val="0"/>
+        <w:rPr/>
+      </w:pPr>
+      <w:r>
+        <w:rPr/>
+      </w:r>
+    </w:p>
+    <w:p>
+      <w:pPr>
+        <w:pStyle w:val="Normal"/>
+        <w:bidi w:val="0"/>
+        <w:rPr/>
+      </w:pPr>
+      <w:r>
+        <w:rPr/>
+      </w:r>
+    </w:p>
+    <w:p>
+      <w:pPr>
+        <w:pStyle w:val="Normal"/>
+        <w:bidi w:val="0"/>
+        <w:rPr/>
+      </w:pPr>
+      <w:r>
+        <w:rPr/>
+      </w:r>
+    </w:p>
+    <w:p>
+      <w:pPr>
+        <w:pStyle w:val="Normal"/>
+        <w:bidi w:val="0"/>
+        <w:rPr/>
+      </w:pPr>
+      <w:r>
+        <w:rPr/>
+      </w:r>
+    </w:p>
+    <w:p>
+      <w:pPr>
+        <w:pStyle w:val="Normal"/>
+        <w:bidi w:val="0"/>
+        <w:rPr/>
+      </w:pPr>
+      <w:r>
+        <w:rPr/>
+        <w:t>When do we scale, if the numbers are spread out over lots of different units. Since the min and max are spread out we scale.</w:t>
+      </w:r>
+    </w:p>
+    <w:p>
+      <w:pPr>
+        <w:pStyle w:val="Normal"/>
+        <w:bidi w:val="0"/>
+        <w:rPr/>
+      </w:pPr>
+      <w:r>
+        <w:rPr/>
+      </w:r>
+    </w:p>
+    <w:p>
+      <w:pPr>
+        <w:pStyle w:val="Normal"/>
+        <w:bidi w:val="0"/>
+        <w:rPr/>
+      </w:pPr>
+      <w:r>
+        <w:rPr/>
+        <w:t>if normally distr</w:t>
+      </w:r>
+      <w:r>
+        <w:rPr/>
+        <w:t>ibuted</w:t>
+      </w:r>
+      <w:r>
+        <w:rPr/>
+        <w:t xml:space="preserve"> the mean and median will be the same</w:t>
+      </w:r>
+    </w:p>
+    <w:p>
+      <w:pPr>
+        <w:pStyle w:val="Normal"/>
+        <w:bidi w:val="0"/>
+        <w:rPr/>
+      </w:pPr>
+      <w:r>
+        <w:rPr/>
+      </w:r>
+    </w:p>
+    <w:p>
+      <w:pPr>
+        <w:pStyle w:val="Normal"/>
+        <w:bidi w:val="0"/>
+        <w:rPr/>
+      </w:pPr>
+      <w:r>
+        <w:rPr/>
+      </w:r>
+    </w:p>
+    <w:p>
+      <w:pPr>
+        <w:pStyle w:val="Normal"/>
+        <w:bidi w:val="0"/>
+        <w:rPr/>
+      </w:pPr>
+      <w:r>
+        <w:rPr/>
+      </w:r>
+    </w:p>
+    <w:p>
+      <w:pPr>
+        <w:pStyle w:val="Normal"/>
+        <w:bidi w:val="0"/>
+        <w:rPr/>
+      </w:pPr>
+      <w:r>
+        <w:rPr/>
+      </w:r>
+    </w:p>
+    <w:p>
+      <w:pPr>
+        <w:pStyle w:val="Normal"/>
+        <w:bidi w:val="0"/>
+        <w:rPr/>
+      </w:pPr>
+      <w:r>
+        <w:rPr/>
+      </w:r>
+      <w:r>
+        <w:br w:type="page"/>
       </w:r>
     </w:p>
     <w:p>

</xml_diff>